<commit_message>
docs: rebuild bilingual hardware guide
</commit_message>
<xml_diff>
--- a/幻13 固态转接板 使用说明.docx
+++ b/幻13 固态转接板 使用说明.docx
@@ -3513,7 +3513,7 @@
         <w:rPr>
           <w:rFonts w:hint="eastAsia"/>
         </w:rPr>
-        <w:t>3572265407</w:t>
+        <w:t>[REDACTED]</w:t>
       </w:r>
     </w:p>
     <w:p>
@@ -3542,7 +3542,7 @@
         <w:rPr>
           <w:rFonts w:hint="eastAsia"/>
         </w:rPr>
-        <w:t>851724625</w:t>
+        <w:t>[REDACTED</w:t>
       </w:r>
     </w:p>
     <w:p>

</xml_diff>